<commit_message>
Phase 2: Standardize field name from 'error' to 'message'
Replaced 'error' => with 'message' => in all backend API files for
consistent JSON response structure:

- inc/standbelegung/save_entry.php (4 occurrences)
- inc/cup2/save_pairs.php (5 occurrences)
- inc/endresultate_partner/delete_partner.php (4 occurrences)
- inc/endresultate_partner/delete_year_data.php (2 occurrences)
- inc/endresultate_partner/save_partner_schuss.php (5 occurrences)
- inc/jmdefinition/delete_gruppe.php (4 occurrences)
- inc/jmdefinition/save_gruppen.php (2 occurrences)
- inc/jshelfer/delete_jshelfer.php (2 occurrences)
- inc/jshelfer/save_jshelfer.php (2 occurrences)
- inc/standbelegung/delete_entries.php (3 occurrences)
- inc/standbelegung/delete_standbelegung.php (2 occurrences)
- inc/standbelegung/save_standbelegung.php (2 occurrences)

Total: 12 files updated, ~37 occurrences fixed

Co-Authored-By: Claude Sonnet 4.5 <noreply@anthropic.com>
</commit_message>
<xml_diff>
--- a/inc/absenden/dat/Resultatbuch_Template20251015.docx
+++ b/inc/absenden/dat/Resultatbuch_Template20251015.docx
@@ -443,7 +443,23 @@
           <w:i/>
         </w:rPr>
         <w:br/>
-        <w:t>${PrintDate}</w:t>
+        <w:t>${</w:t>
+      </w:r>
+      <w:proofErr w:type="spellStart"/>
+      <w:r>
+        <w:rPr>
+          <w:rFonts w:cs="Times New Roman"/>
+          <w:i/>
+        </w:rPr>
+        <w:t>PrintDate</w:t>
+      </w:r>
+      <w:proofErr w:type="spellEnd"/>
+      <w:r>
+        <w:rPr>
+          <w:rFonts w:cs="Times New Roman"/>
+          <w:i/>
+        </w:rPr>
+        <w:t>}</w:t>
       </w:r>
     </w:p>
     <w:p>
@@ -471,6 +487,7 @@
           <w:szCs w:val="28"/>
         </w:rPr>
       </w:pPr>
+      <w:proofErr w:type="spellStart"/>
       <w:r>
         <w:rPr>
           <w:rFonts w:cs="Times New Roman"/>
@@ -482,6 +499,7 @@
         <w:lastRenderedPageBreak/>
         <w:t>Endstich</w:t>
       </w:r>
+      <w:proofErr w:type="spellEnd"/>
     </w:p>
     <w:tbl>
       <w:tblPr>
@@ -993,7 +1011,25 @@
                 <w:bCs/>
                 <w:szCs w:val="18"/>
               </w:rPr>
-              <w:t>${ESRang}</w:t>
+              <w:t>${</w:t>
+            </w:r>
+            <w:proofErr w:type="spellStart"/>
+            <w:r>
+              <w:rPr>
+                <w:rFonts w:cs="Times New Roman"/>
+                <w:bCs/>
+                <w:szCs w:val="18"/>
+              </w:rPr>
+              <w:t>ESRang</w:t>
+            </w:r>
+            <w:proofErr w:type="spellEnd"/>
+            <w:r>
+              <w:rPr>
+                <w:rFonts w:cs="Times New Roman"/>
+                <w:bCs/>
+                <w:szCs w:val="18"/>
+              </w:rPr>
+              <w:t>}</w:t>
             </w:r>
           </w:p>
         </w:tc>
@@ -1015,7 +1051,25 @@
                 <w:bCs/>
                 <w:szCs w:val="18"/>
               </w:rPr>
-              <w:t>${ESName}</w:t>
+              <w:t>${</w:t>
+            </w:r>
+            <w:proofErr w:type="spellStart"/>
+            <w:r>
+              <w:rPr>
+                <w:rFonts w:cs="Times New Roman"/>
+                <w:bCs/>
+                <w:szCs w:val="18"/>
+              </w:rPr>
+              <w:t>ESName</w:t>
+            </w:r>
+            <w:proofErr w:type="spellEnd"/>
+            <w:r>
+              <w:rPr>
+                <w:rFonts w:cs="Times New Roman"/>
+                <w:bCs/>
+                <w:szCs w:val="18"/>
+              </w:rPr>
+              <w:t>}</w:t>
             </w:r>
           </w:p>
         </w:tc>
@@ -1342,27 +1396,7 @@
           <w:szCs w:val="28"/>
         </w:rPr>
         <w:lastRenderedPageBreak/>
-        <w:t>Sch</w:t>
-      </w:r>
-      <w:r>
-        <w:rPr>
-          <w:rFonts w:cs="Times New Roman"/>
-          <w:b/>
-          <w:bCs/>
-          <w:sz w:val="28"/>
-          <w:szCs w:val="28"/>
-        </w:rPr>
-        <w:t>w</w:t>
-      </w:r>
-      <w:r>
-        <w:rPr>
-          <w:rFonts w:cs="Times New Roman"/>
-          <w:b/>
-          <w:bCs/>
-          <w:sz w:val="28"/>
-          <w:szCs w:val="28"/>
-        </w:rPr>
-        <w:t>inistich</w:t>
+        <w:t>Schinistich</w:t>
       </w:r>
     </w:p>
     <w:tbl>
@@ -1801,7 +1835,25 @@
                 <w:bCs/>
                 <w:szCs w:val="18"/>
               </w:rPr>
-              <w:t>${SRang}</w:t>
+              <w:t>${</w:t>
+            </w:r>
+            <w:proofErr w:type="spellStart"/>
+            <w:r>
+              <w:rPr>
+                <w:rFonts w:cs="Times New Roman"/>
+                <w:bCs/>
+                <w:szCs w:val="18"/>
+              </w:rPr>
+              <w:t>SRang</w:t>
+            </w:r>
+            <w:proofErr w:type="spellEnd"/>
+            <w:r>
+              <w:rPr>
+                <w:rFonts w:cs="Times New Roman"/>
+                <w:bCs/>
+                <w:szCs w:val="18"/>
+              </w:rPr>
+              <w:t>}</w:t>
             </w:r>
           </w:p>
         </w:tc>
@@ -1823,7 +1875,25 @@
                 <w:bCs/>
                 <w:szCs w:val="18"/>
               </w:rPr>
-              <w:t>${SName}</w:t>
+              <w:t>${</w:t>
+            </w:r>
+            <w:proofErr w:type="spellStart"/>
+            <w:r>
+              <w:rPr>
+                <w:rFonts w:cs="Times New Roman"/>
+                <w:bCs/>
+                <w:szCs w:val="18"/>
+              </w:rPr>
+              <w:t>SName</w:t>
+            </w:r>
+            <w:proofErr w:type="spellEnd"/>
+            <w:r>
+              <w:rPr>
+                <w:rFonts w:cs="Times New Roman"/>
+                <w:bCs/>
+                <w:szCs w:val="18"/>
+              </w:rPr>
+              <w:t>}</w:t>
             </w:r>
           </w:p>
         </w:tc>
@@ -2566,6 +2636,7 @@
           <w:szCs w:val="28"/>
         </w:rPr>
       </w:pPr>
+      <w:proofErr w:type="spellStart"/>
       <w:r>
         <w:rPr>
           <w:rFonts w:cs="Times New Roman"/>
@@ -2574,7 +2645,18 @@
           <w:sz w:val="28"/>
           <w:szCs w:val="28"/>
         </w:rPr>
-        <w:t>Schwinistich-Sieger seit 1999</w:t>
+        <w:t>Schwinistich</w:t>
+      </w:r>
+      <w:proofErr w:type="spellEnd"/>
+      <w:r>
+        <w:rPr>
+          <w:rFonts w:cs="Times New Roman"/>
+          <w:b/>
+          <w:bCs/>
+          <w:sz w:val="28"/>
+          <w:szCs w:val="28"/>
+        </w:rPr>
+        <w:t>-Sieger seit 1999</w:t>
       </w:r>
     </w:p>
     <w:tbl>
@@ -3072,6 +3154,7 @@
           <w:szCs w:val="28"/>
         </w:rPr>
       </w:pPr>
+      <w:proofErr w:type="spellStart"/>
       <w:r>
         <w:rPr>
           <w:rFonts w:cs="Times New Roman"/>
@@ -3083,6 +3166,7 @@
         <w:lastRenderedPageBreak/>
         <w:t>Zabigstich</w:t>
       </w:r>
+      <w:proofErr w:type="spellEnd"/>
     </w:p>
     <w:tbl>
       <w:tblPr>
@@ -3480,7 +3564,25 @@
                 <w:bCs/>
                 <w:szCs w:val="18"/>
               </w:rPr>
-              <w:t>${ZRang}</w:t>
+              <w:t>${</w:t>
+            </w:r>
+            <w:proofErr w:type="spellStart"/>
+            <w:r>
+              <w:rPr>
+                <w:rFonts w:cs="Times New Roman"/>
+                <w:bCs/>
+                <w:szCs w:val="18"/>
+              </w:rPr>
+              <w:t>ZRang</w:t>
+            </w:r>
+            <w:proofErr w:type="spellEnd"/>
+            <w:r>
+              <w:rPr>
+                <w:rFonts w:cs="Times New Roman"/>
+                <w:bCs/>
+                <w:szCs w:val="18"/>
+              </w:rPr>
+              <w:t>}</w:t>
             </w:r>
           </w:p>
         </w:tc>
@@ -3502,7 +3604,25 @@
                 <w:bCs/>
                 <w:szCs w:val="18"/>
               </w:rPr>
-              <w:t>${ZName}</w:t>
+              <w:t>${</w:t>
+            </w:r>
+            <w:proofErr w:type="spellStart"/>
+            <w:r>
+              <w:rPr>
+                <w:rFonts w:cs="Times New Roman"/>
+                <w:bCs/>
+                <w:szCs w:val="18"/>
+              </w:rPr>
+              <w:t>ZName</w:t>
+            </w:r>
+            <w:proofErr w:type="spellEnd"/>
+            <w:r>
+              <w:rPr>
+                <w:rFonts w:cs="Times New Roman"/>
+                <w:bCs/>
+                <w:szCs w:val="18"/>
+              </w:rPr>
+              <w:t>}</w:t>
             </w:r>
           </w:p>
         </w:tc>
@@ -4015,6 +4135,7 @@
               </w:rPr>
               <w:t>${</w:t>
             </w:r>
+            <w:proofErr w:type="spellStart"/>
             <w:r>
               <w:rPr>
                 <w:rFonts w:cs="Times New Roman"/>
@@ -4023,6 +4144,7 @@
               </w:rPr>
               <w:t>GRang</w:t>
             </w:r>
+            <w:proofErr w:type="spellEnd"/>
             <w:r>
               <w:rPr>
                 <w:rFonts w:cs="Times New Roman"/>
@@ -4056,6 +4178,7 @@
               </w:rPr>
               <w:t>${</w:t>
             </w:r>
+            <w:proofErr w:type="spellStart"/>
             <w:r>
               <w:rPr>
                 <w:rFonts w:cs="Times New Roman"/>
@@ -4064,6 +4187,7 @@
               </w:rPr>
               <w:t>GName</w:t>
             </w:r>
+            <w:proofErr w:type="spellEnd"/>
             <w:r>
               <w:rPr>
                 <w:rFonts w:cs="Times New Roman"/>
@@ -4097,6 +4221,7 @@
               </w:rPr>
               <w:t>${</w:t>
             </w:r>
+            <w:proofErr w:type="spellStart"/>
             <w:r>
               <w:rPr>
                 <w:rFonts w:cs="Times New Roman"/>
@@ -4105,6 +4230,7 @@
               </w:rPr>
               <w:t>GMax</w:t>
             </w:r>
+            <w:proofErr w:type="spellEnd"/>
             <w:r>
               <w:rPr>
                 <w:rFonts w:cs="Times New Roman"/>
@@ -4154,6 +4280,7 @@
               </w:rPr>
               <w:t>G2</w:t>
             </w:r>
+            <w:proofErr w:type="gramStart"/>
             <w:r>
               <w:rPr>
                 <w:rFonts w:cs="Times New Roman"/>
@@ -4168,7 +4295,16 @@
                 <w:bCs/>
                 <w:szCs w:val="18"/>
               </w:rPr>
-              <w:t>,  ${G3})</w:t>
+              <w:t>,  $</w:t>
+            </w:r>
+            <w:proofErr w:type="gramEnd"/>
+            <w:r>
+              <w:rPr>
+                <w:rFonts w:cs="Times New Roman"/>
+                <w:bCs/>
+                <w:szCs w:val="18"/>
+              </w:rPr>
+              <w:t>{G3})</w:t>
             </w:r>
           </w:p>
         </w:tc>
@@ -4231,6 +4367,7 @@
           <w:szCs w:val="28"/>
         </w:rPr>
       </w:pPr>
+      <w:proofErr w:type="spellStart"/>
       <w:r>
         <w:rPr>
           <w:rFonts w:cs="Times New Roman"/>
@@ -4240,7 +4377,18 @@
           <w:szCs w:val="28"/>
         </w:rPr>
         <w:lastRenderedPageBreak/>
-        <w:t>Zabigstich Sieger seit 1999</w:t>
+        <w:t>Zabigstich</w:t>
+      </w:r>
+      <w:proofErr w:type="spellEnd"/>
+      <w:r>
+        <w:rPr>
+          <w:rFonts w:cs="Times New Roman"/>
+          <w:b/>
+          <w:bCs/>
+          <w:sz w:val="28"/>
+          <w:szCs w:val="28"/>
+        </w:rPr>
+        <w:t xml:space="preserve"> Sieger seit 1999</w:t>
       </w:r>
     </w:p>
     <w:tbl>
@@ -6194,7 +6342,25 @@
                 <w:bCs/>
                 <w:szCs w:val="18"/>
               </w:rPr>
-              <w:t>${KRang}</w:t>
+              <w:t>${</w:t>
+            </w:r>
+            <w:proofErr w:type="spellStart"/>
+            <w:r>
+              <w:rPr>
+                <w:rFonts w:cs="Times New Roman"/>
+                <w:bCs/>
+                <w:szCs w:val="18"/>
+              </w:rPr>
+              <w:t>KRang</w:t>
+            </w:r>
+            <w:proofErr w:type="spellEnd"/>
+            <w:r>
+              <w:rPr>
+                <w:rFonts w:cs="Times New Roman"/>
+                <w:bCs/>
+                <w:szCs w:val="18"/>
+              </w:rPr>
+              <w:t>}</w:t>
             </w:r>
           </w:p>
         </w:tc>
@@ -6216,7 +6382,25 @@
                 <w:bCs/>
                 <w:szCs w:val="18"/>
               </w:rPr>
-              <w:t>${KName}</w:t>
+              <w:t>${</w:t>
+            </w:r>
+            <w:proofErr w:type="spellStart"/>
+            <w:r>
+              <w:rPr>
+                <w:rFonts w:cs="Times New Roman"/>
+                <w:bCs/>
+                <w:szCs w:val="18"/>
+              </w:rPr>
+              <w:t>KName</w:t>
+            </w:r>
+            <w:proofErr w:type="spellEnd"/>
+            <w:r>
+              <w:rPr>
+                <w:rFonts w:cs="Times New Roman"/>
+                <w:bCs/>
+                <w:szCs w:val="18"/>
+              </w:rPr>
+              <w:t>}</w:t>
             </w:r>
           </w:p>
         </w:tc>
@@ -6521,6 +6705,7 @@
                 <w:szCs w:val="18"/>
               </w:rPr>
             </w:pPr>
+            <w:proofErr w:type="spellStart"/>
             <w:r>
               <w:rPr>
                 <w:rFonts w:cs="Times New Roman"/>
@@ -6529,6 +6714,7 @@
               </w:rPr>
               <w:t>Rg</w:t>
             </w:r>
+            <w:proofErr w:type="spellEnd"/>
           </w:p>
         </w:tc>
         <w:tc>
@@ -6901,7 +7087,25 @@
                 <w:bCs/>
                 <w:szCs w:val="18"/>
               </w:rPr>
-              <w:t>${EARang}</w:t>
+              <w:t>${</w:t>
+            </w:r>
+            <w:proofErr w:type="spellStart"/>
+            <w:r>
+              <w:rPr>
+                <w:rFonts w:cs="Times New Roman"/>
+                <w:bCs/>
+                <w:szCs w:val="18"/>
+              </w:rPr>
+              <w:t>EARang</w:t>
+            </w:r>
+            <w:proofErr w:type="spellEnd"/>
+            <w:r>
+              <w:rPr>
+                <w:rFonts w:cs="Times New Roman"/>
+                <w:bCs/>
+                <w:szCs w:val="18"/>
+              </w:rPr>
+              <w:t>}</w:t>
             </w:r>
           </w:p>
         </w:tc>
@@ -6923,7 +7127,25 @@
                 <w:bCs/>
                 <w:szCs w:val="18"/>
               </w:rPr>
-              <w:t>${EAName}</w:t>
+              <w:t>${</w:t>
+            </w:r>
+            <w:proofErr w:type="spellStart"/>
+            <w:r>
+              <w:rPr>
+                <w:rFonts w:cs="Times New Roman"/>
+                <w:bCs/>
+                <w:szCs w:val="18"/>
+              </w:rPr>
+              <w:t>EAName</w:t>
+            </w:r>
+            <w:proofErr w:type="spellEnd"/>
+            <w:r>
+              <w:rPr>
+                <w:rFonts w:cs="Times New Roman"/>
+                <w:bCs/>
+                <w:szCs w:val="18"/>
+              </w:rPr>
+              <w:t>}</w:t>
             </w:r>
           </w:p>
         </w:tc>
@@ -7161,6 +7383,7 @@
                 <w:szCs w:val="18"/>
               </w:rPr>
             </w:pPr>
+            <w:proofErr w:type="spellStart"/>
             <w:r>
               <w:rPr>
                 <w:rFonts w:cs="Times New Roman"/>
@@ -7169,6 +7392,7 @@
               </w:rPr>
               <w:t>Rg</w:t>
             </w:r>
+            <w:proofErr w:type="spellEnd"/>
           </w:p>
         </w:tc>
         <w:tc>
@@ -7541,7 +7765,25 @@
                 <w:bCs/>
                 <w:szCs w:val="18"/>
               </w:rPr>
-              <w:t>${EBRang}</w:t>
+              <w:t>${</w:t>
+            </w:r>
+            <w:proofErr w:type="spellStart"/>
+            <w:r>
+              <w:rPr>
+                <w:rFonts w:cs="Times New Roman"/>
+                <w:bCs/>
+                <w:szCs w:val="18"/>
+              </w:rPr>
+              <w:t>EBRang</w:t>
+            </w:r>
+            <w:proofErr w:type="spellEnd"/>
+            <w:r>
+              <w:rPr>
+                <w:rFonts w:cs="Times New Roman"/>
+                <w:bCs/>
+                <w:szCs w:val="18"/>
+              </w:rPr>
+              <w:t>}</w:t>
             </w:r>
           </w:p>
         </w:tc>
@@ -7563,7 +7805,25 @@
                 <w:bCs/>
                 <w:szCs w:val="18"/>
               </w:rPr>
-              <w:t>${EBName}</w:t>
+              <w:t>${</w:t>
+            </w:r>
+            <w:proofErr w:type="spellStart"/>
+            <w:r>
+              <w:rPr>
+                <w:rFonts w:cs="Times New Roman"/>
+                <w:bCs/>
+                <w:szCs w:val="18"/>
+              </w:rPr>
+              <w:t>EBName</w:t>
+            </w:r>
+            <w:proofErr w:type="spellEnd"/>
+            <w:r>
+              <w:rPr>
+                <w:rFonts w:cs="Times New Roman"/>
+                <w:bCs/>
+                <w:szCs w:val="18"/>
+              </w:rPr>
+              <w:t>}</w:t>
             </w:r>
           </w:p>
         </w:tc>
@@ -7811,6 +8071,7 @@
                 <w:szCs w:val="18"/>
               </w:rPr>
             </w:pPr>
+            <w:proofErr w:type="spellStart"/>
             <w:r>
               <w:rPr>
                 <w:rFonts w:cs="Times New Roman"/>
@@ -7819,6 +8080,7 @@
               </w:rPr>
               <w:t>Rg</w:t>
             </w:r>
+            <w:proofErr w:type="spellEnd"/>
           </w:p>
         </w:tc>
         <w:tc>
@@ -8177,6 +8439,7 @@
               </w:rPr>
               <w:t>${</w:t>
             </w:r>
+            <w:proofErr w:type="spellStart"/>
             <w:r>
               <w:rPr>
                 <w:rFonts w:cs="Times New Roman"/>
@@ -8191,7 +8454,16 @@
                 <w:bCs/>
                 <w:szCs w:val="18"/>
               </w:rPr>
-              <w:t>Rang}</w:t>
+              <w:t>Rang</w:t>
+            </w:r>
+            <w:proofErr w:type="spellEnd"/>
+            <w:r>
+              <w:rPr>
+                <w:rFonts w:cs="Times New Roman"/>
+                <w:bCs/>
+                <w:szCs w:val="18"/>
+              </w:rPr>
+              <w:t>}</w:t>
             </w:r>
           </w:p>
         </w:tc>
@@ -8215,6 +8487,7 @@
               </w:rPr>
               <w:t>${</w:t>
             </w:r>
+            <w:proofErr w:type="spellStart"/>
             <w:r>
               <w:rPr>
                 <w:rFonts w:cs="Times New Roman"/>
@@ -8229,7 +8502,16 @@
                 <w:bCs/>
                 <w:szCs w:val="18"/>
               </w:rPr>
-              <w:t>Name}</w:t>
+              <w:t>Name</w:t>
+            </w:r>
+            <w:proofErr w:type="spellEnd"/>
+            <w:r>
+              <w:rPr>
+                <w:rFonts w:cs="Times New Roman"/>
+                <w:bCs/>
+                <w:szCs w:val="18"/>
+              </w:rPr>
+              <w:t>}</w:t>
             </w:r>
           </w:p>
         </w:tc>
@@ -8517,6 +8799,7 @@
                 <w:szCs w:val="18"/>
               </w:rPr>
             </w:pPr>
+            <w:proofErr w:type="spellStart"/>
             <w:r>
               <w:rPr>
                 <w:rFonts w:cs="Times New Roman"/>
@@ -8525,6 +8808,7 @@
               </w:rPr>
               <w:t>Rg</w:t>
             </w:r>
+            <w:proofErr w:type="spellEnd"/>
           </w:p>
         </w:tc>
         <w:tc>
@@ -8875,6 +9159,8 @@
               </w:rPr>
               <w:t>${</w:t>
             </w:r>
+            <w:proofErr w:type="spellStart"/>
+            <w:proofErr w:type="gramStart"/>
             <w:r>
               <w:rPr>
                 <w:rFonts w:cs="Times New Roman"/>
@@ -8889,7 +9175,17 @@
                 <w:bCs/>
                 <w:szCs w:val="18"/>
               </w:rPr>
-              <w:t>Rang}</w:t>
+              <w:t>Rang</w:t>
+            </w:r>
+            <w:proofErr w:type="spellEnd"/>
+            <w:proofErr w:type="gramEnd"/>
+            <w:r>
+              <w:rPr>
+                <w:rFonts w:cs="Times New Roman"/>
+                <w:bCs/>
+                <w:szCs w:val="18"/>
+              </w:rPr>
+              <w:t>}</w:t>
             </w:r>
           </w:p>
         </w:tc>
@@ -8913,6 +9209,7 @@
               </w:rPr>
               <w:t>${</w:t>
             </w:r>
+            <w:proofErr w:type="spellStart"/>
             <w:r>
               <w:rPr>
                 <w:rFonts w:cs="Times New Roman"/>
@@ -8927,7 +9224,16 @@
                 <w:bCs/>
                 <w:szCs w:val="18"/>
               </w:rPr>
-              <w:t>Name}</w:t>
+              <w:t>Name</w:t>
+            </w:r>
+            <w:proofErr w:type="spellEnd"/>
+            <w:r>
+              <w:rPr>
+                <w:rFonts w:cs="Times New Roman"/>
+                <w:bCs/>
+                <w:szCs w:val="18"/>
+              </w:rPr>
+              <w:t>}</w:t>
             </w:r>
           </w:p>
         </w:tc>
@@ -9124,7 +9430,31 @@
           <w:sz w:val="28"/>
           <w:szCs w:val="28"/>
         </w:rPr>
-        <w:t>${/Partner_BLOCK}</w:t>
+        <w:t>${/</w:t>
+      </w:r>
+      <w:proofErr w:type="spellStart"/>
+      <w:r>
+        <w:rPr>
+          <w:rFonts w:cs="Times New Roman"/>
+          <w:b/>
+          <w:bCs/>
+          <w:color w:val="FFFFFF" w:themeColor="background1"/>
+          <w:sz w:val="28"/>
+          <w:szCs w:val="28"/>
+        </w:rPr>
+        <w:t>Partner_BLOCK</w:t>
+      </w:r>
+      <w:proofErr w:type="spellEnd"/>
+      <w:r>
+        <w:rPr>
+          <w:rFonts w:cs="Times New Roman"/>
+          <w:b/>
+          <w:bCs/>
+          <w:color w:val="FFFFFF" w:themeColor="background1"/>
+          <w:sz w:val="28"/>
+          <w:szCs w:val="28"/>
+        </w:rPr>
+        <w:t>}</w:t>
       </w:r>
     </w:p>
     <w:p>
@@ -10694,7 +11024,23 @@
                 <w:rFonts w:cs="Times New Roman"/>
                 <w:szCs w:val="18"/>
               </w:rPr>
-              <w:t>von Euw Alexander</w:t>
+              <w:t xml:space="preserve">von </w:t>
+            </w:r>
+            <w:proofErr w:type="spellStart"/>
+            <w:r>
+              <w:rPr>
+                <w:rFonts w:cs="Times New Roman"/>
+                <w:szCs w:val="18"/>
+              </w:rPr>
+              <w:t>Euw</w:t>
+            </w:r>
+            <w:proofErr w:type="spellEnd"/>
+            <w:r>
+              <w:rPr>
+                <w:rFonts w:cs="Times New Roman"/>
+                <w:szCs w:val="18"/>
+              </w:rPr>
+              <w:t xml:space="preserve"> Alexander</w:t>
             </w:r>
           </w:p>
         </w:tc>
@@ -11955,8 +12301,17 @@
                 <w:rFonts w:cs="Times New Roman"/>
                 <w:szCs w:val="18"/>
               </w:rPr>
-              <w:t>Eberle Jeaninne</w:t>
-            </w:r>
+              <w:t xml:space="preserve">Eberle </w:t>
+            </w:r>
+            <w:proofErr w:type="spellStart"/>
+            <w:r>
+              <w:rPr>
+                <w:rFonts w:cs="Times New Roman"/>
+                <w:szCs w:val="18"/>
+              </w:rPr>
+              <w:t>Jeaninne</w:t>
+            </w:r>
+            <w:proofErr w:type="spellEnd"/>
           </w:p>
         </w:tc>
         <w:tc>
@@ -13411,6 +13766,7 @@
                 <w:szCs w:val="18"/>
               </w:rPr>
             </w:pPr>
+            <w:proofErr w:type="spellStart"/>
             <w:r>
               <w:rPr>
                 <w:rFonts w:cs="Times New Roman"/>
@@ -13427,6 +13783,7 @@
               </w:rPr>
               <w:t>g</w:t>
             </w:r>
+            <w:proofErr w:type="spellEnd"/>
           </w:p>
         </w:tc>
         <w:tc>
@@ -13798,7 +14155,25 @@
                 <w:bCs/>
                 <w:szCs w:val="18"/>
               </w:rPr>
-              <w:t>${HARang}</w:t>
+              <w:t>${</w:t>
+            </w:r>
+            <w:proofErr w:type="spellStart"/>
+            <w:r>
+              <w:rPr>
+                <w:rFonts w:cs="Times New Roman"/>
+                <w:bCs/>
+                <w:szCs w:val="18"/>
+              </w:rPr>
+              <w:t>HARang</w:t>
+            </w:r>
+            <w:proofErr w:type="spellEnd"/>
+            <w:r>
+              <w:rPr>
+                <w:rFonts w:cs="Times New Roman"/>
+                <w:bCs/>
+                <w:szCs w:val="18"/>
+              </w:rPr>
+              <w:t>}</w:t>
             </w:r>
           </w:p>
         </w:tc>
@@ -13820,7 +14195,25 @@
                 <w:bCs/>
                 <w:szCs w:val="18"/>
               </w:rPr>
-              <w:t>${HAName}</w:t>
+              <w:t>${</w:t>
+            </w:r>
+            <w:proofErr w:type="spellStart"/>
+            <w:r>
+              <w:rPr>
+                <w:rFonts w:cs="Times New Roman"/>
+                <w:bCs/>
+                <w:szCs w:val="18"/>
+              </w:rPr>
+              <w:t>HAName</w:t>
+            </w:r>
+            <w:proofErr w:type="spellEnd"/>
+            <w:r>
+              <w:rPr>
+                <w:rFonts w:cs="Times New Roman"/>
+                <w:bCs/>
+                <w:szCs w:val="18"/>
+              </w:rPr>
+              <w:t>}</w:t>
             </w:r>
           </w:p>
         </w:tc>
@@ -14140,6 +14533,7 @@
                 <w:szCs w:val="18"/>
               </w:rPr>
             </w:pPr>
+            <w:proofErr w:type="spellStart"/>
             <w:r>
               <w:rPr>
                 <w:rFonts w:cs="Times New Roman"/>
@@ -14156,6 +14550,7 @@
               </w:rPr>
               <w:t>g</w:t>
             </w:r>
+            <w:proofErr w:type="spellEnd"/>
           </w:p>
         </w:tc>
         <w:tc>
@@ -14527,7 +14922,25 @@
                 <w:bCs/>
                 <w:szCs w:val="18"/>
               </w:rPr>
-              <w:t>${HBRang}</w:t>
+              <w:t>${</w:t>
+            </w:r>
+            <w:proofErr w:type="spellStart"/>
+            <w:r>
+              <w:rPr>
+                <w:rFonts w:cs="Times New Roman"/>
+                <w:bCs/>
+                <w:szCs w:val="18"/>
+              </w:rPr>
+              <w:t>HBRang</w:t>
+            </w:r>
+            <w:proofErr w:type="spellEnd"/>
+            <w:r>
+              <w:rPr>
+                <w:rFonts w:cs="Times New Roman"/>
+                <w:bCs/>
+                <w:szCs w:val="18"/>
+              </w:rPr>
+              <w:t>}</w:t>
             </w:r>
           </w:p>
         </w:tc>
@@ -14549,7 +14962,25 @@
                 <w:bCs/>
                 <w:szCs w:val="18"/>
               </w:rPr>
-              <w:t>${HBName}</w:t>
+              <w:t>${</w:t>
+            </w:r>
+            <w:proofErr w:type="spellStart"/>
+            <w:r>
+              <w:rPr>
+                <w:rFonts w:cs="Times New Roman"/>
+                <w:bCs/>
+                <w:szCs w:val="18"/>
+              </w:rPr>
+              <w:t>HBName</w:t>
+            </w:r>
+            <w:proofErr w:type="spellEnd"/>
+            <w:r>
+              <w:rPr>
+                <w:rFonts w:cs="Times New Roman"/>
+                <w:bCs/>
+                <w:szCs w:val="18"/>
+              </w:rPr>
+              <w:t>}</w:t>
             </w:r>
           </w:p>
         </w:tc>
@@ -16298,7 +16729,23 @@
                 <w:rFonts w:cs="Times New Roman"/>
                 <w:szCs w:val="18"/>
               </w:rPr>
-              <w:t>${aRang}</w:t>
+              <w:t>${</w:t>
+            </w:r>
+            <w:proofErr w:type="spellStart"/>
+            <w:r>
+              <w:rPr>
+                <w:rFonts w:cs="Times New Roman"/>
+                <w:szCs w:val="18"/>
+              </w:rPr>
+              <w:t>aRang</w:t>
+            </w:r>
+            <w:proofErr w:type="spellEnd"/>
+            <w:r>
+              <w:rPr>
+                <w:rFonts w:cs="Times New Roman"/>
+                <w:szCs w:val="18"/>
+              </w:rPr>
+              <w:t>}</w:t>
             </w:r>
           </w:p>
         </w:tc>
@@ -16318,7 +16765,23 @@
                 <w:rFonts w:cs="Times New Roman"/>
                 <w:szCs w:val="18"/>
               </w:rPr>
-              <w:t>${KantonalA}</w:t>
+              <w:t>${</w:t>
+            </w:r>
+            <w:proofErr w:type="spellStart"/>
+            <w:r>
+              <w:rPr>
+                <w:rFonts w:cs="Times New Roman"/>
+                <w:szCs w:val="18"/>
+              </w:rPr>
+              <w:t>KantonalA</w:t>
+            </w:r>
+            <w:proofErr w:type="spellEnd"/>
+            <w:r>
+              <w:rPr>
+                <w:rFonts w:cs="Times New Roman"/>
+                <w:szCs w:val="18"/>
+              </w:rPr>
+              <w:t>}</w:t>
             </w:r>
           </w:p>
         </w:tc>
@@ -16465,7 +16928,23 @@
                 <w:rFonts w:cs="Times New Roman"/>
                 <w:szCs w:val="18"/>
               </w:rPr>
-              <w:t>${aKantonalSumme}</w:t>
+              <w:t>${</w:t>
+            </w:r>
+            <w:proofErr w:type="spellStart"/>
+            <w:r>
+              <w:rPr>
+                <w:rFonts w:cs="Times New Roman"/>
+                <w:szCs w:val="18"/>
+              </w:rPr>
+              <w:t>aKantonalSumme</w:t>
+            </w:r>
+            <w:proofErr w:type="spellEnd"/>
+            <w:r>
+              <w:rPr>
+                <w:rFonts w:cs="Times New Roman"/>
+                <w:szCs w:val="18"/>
+              </w:rPr>
+              <w:t>}</w:t>
             </w:r>
           </w:p>
         </w:tc>
@@ -16487,7 +16966,23 @@
                 <w:rFonts w:cs="Times New Roman"/>
                 <w:szCs w:val="18"/>
               </w:rPr>
-              <w:t>${aWP}</w:t>
+              <w:t>${</w:t>
+            </w:r>
+            <w:proofErr w:type="spellStart"/>
+            <w:r>
+              <w:rPr>
+                <w:rFonts w:cs="Times New Roman"/>
+                <w:szCs w:val="18"/>
+              </w:rPr>
+              <w:t>aWP</w:t>
+            </w:r>
+            <w:proofErr w:type="spellEnd"/>
+            <w:r>
+              <w:rPr>
+                <w:rFonts w:cs="Times New Roman"/>
+                <w:szCs w:val="18"/>
+              </w:rPr>
+              <w:t>}</w:t>
             </w:r>
           </w:p>
         </w:tc>
@@ -16946,7 +17441,23 @@
                 <w:rFonts w:cs="Times New Roman"/>
                 <w:szCs w:val="18"/>
               </w:rPr>
-              <w:t>${bRang}</w:t>
+              <w:t>${</w:t>
+            </w:r>
+            <w:proofErr w:type="spellStart"/>
+            <w:r>
+              <w:rPr>
+                <w:rFonts w:cs="Times New Roman"/>
+                <w:szCs w:val="18"/>
+              </w:rPr>
+              <w:t>bRang</w:t>
+            </w:r>
+            <w:proofErr w:type="spellEnd"/>
+            <w:r>
+              <w:rPr>
+                <w:rFonts w:cs="Times New Roman"/>
+                <w:szCs w:val="18"/>
+              </w:rPr>
+              <w:t>}</w:t>
             </w:r>
           </w:p>
         </w:tc>
@@ -16968,6 +17479,7 @@
               </w:rPr>
               <w:t>${</w:t>
             </w:r>
+            <w:proofErr w:type="spellStart"/>
             <w:r>
               <w:rPr>
                 <w:rFonts w:cs="Times New Roman"/>
@@ -16980,7 +17492,15 @@
                 <w:rFonts w:cs="Times New Roman"/>
                 <w:szCs w:val="18"/>
               </w:rPr>
-              <w:t>B}</w:t>
+              <w:t>B</w:t>
+            </w:r>
+            <w:proofErr w:type="spellEnd"/>
+            <w:r>
+              <w:rPr>
+                <w:rFonts w:cs="Times New Roman"/>
+                <w:szCs w:val="18"/>
+              </w:rPr>
+              <w:t>}</w:t>
             </w:r>
           </w:p>
         </w:tc>
@@ -17210,7 +17730,15 @@
                 <w:rFonts w:cs="Times New Roman"/>
                 <w:szCs w:val="18"/>
               </w:rPr>
-              <w:t>${b</w:t>
+              <w:t>${</w:t>
+            </w:r>
+            <w:proofErr w:type="spellStart"/>
+            <w:r>
+              <w:rPr>
+                <w:rFonts w:cs="Times New Roman"/>
+                <w:szCs w:val="18"/>
+              </w:rPr>
+              <w:t>b</w:t>
             </w:r>
             <w:r>
               <w:rPr>
@@ -17224,7 +17752,15 @@
                 <w:rFonts w:cs="Times New Roman"/>
                 <w:szCs w:val="18"/>
               </w:rPr>
-              <w:t>Summe}</w:t>
+              <w:t>Summe</w:t>
+            </w:r>
+            <w:proofErr w:type="spellEnd"/>
+            <w:r>
+              <w:rPr>
+                <w:rFonts w:cs="Times New Roman"/>
+                <w:szCs w:val="18"/>
+              </w:rPr>
+              <w:t>}</w:t>
             </w:r>
           </w:p>
         </w:tc>
@@ -17245,7 +17781,23 @@
                 <w:rFonts w:cs="Times New Roman"/>
                 <w:szCs w:val="18"/>
               </w:rPr>
-              <w:t>${bWP}</w:t>
+              <w:t>${</w:t>
+            </w:r>
+            <w:proofErr w:type="spellStart"/>
+            <w:r>
+              <w:rPr>
+                <w:rFonts w:cs="Times New Roman"/>
+                <w:szCs w:val="18"/>
+              </w:rPr>
+              <w:t>bWP</w:t>
+            </w:r>
+            <w:proofErr w:type="spellEnd"/>
+            <w:r>
+              <w:rPr>
+                <w:rFonts w:cs="Times New Roman"/>
+                <w:szCs w:val="18"/>
+              </w:rPr>
+              <w:t>}</w:t>
             </w:r>
           </w:p>
         </w:tc>
@@ -18509,6 +19061,7 @@
           <w:szCs w:val="18"/>
         </w:rPr>
       </w:pPr>
+      <w:proofErr w:type="spellStart"/>
       <w:r>
         <w:rPr>
           <w:rFonts w:cs="Times New Roman"/>
@@ -18517,6 +19070,7 @@
         </w:rPr>
         <w:t>Standcup</w:t>
       </w:r>
+      <w:proofErr w:type="spellEnd"/>
     </w:p>
     <w:p>
       <w:pPr>

</xml_diff>